<commit_message>
Fin de l'exercice sur les VLAN
</commit_message>
<xml_diff>
--- a/RESEAU_LOCAL_ET_SECURITE/Cours09-VLAN/420-2C5-JR_09_Exercice.docx
+++ b/RESEAU_LOCAL_ET_SECURITE/Cours09-VLAN/420-2C5-JR_09_Exercice.docx
@@ -2245,7 +2245,13 @@
               <w:rPr>
                 <w:noProof/>
               </w:rPr>
-              <w:t>AP-PTExterne2</w:t>
+              <w:t>AP-PTExterne</w:t>
+            </w:r>
+            <w:r>
+              <w:rPr>
+                <w:noProof/>
+              </w:rPr>
+              <w:t>1</w:t>
             </w:r>
           </w:p>
         </w:tc>
@@ -2620,7 +2626,13 @@
               <w:rPr>
                 <w:noProof/>
               </w:rPr>
-              <w:t>Switch4</w:t>
+              <w:t>Switch</w:t>
+            </w:r>
+            <w:r>
+              <w:rPr>
+                <w:noProof/>
+              </w:rPr>
+              <w:t>3</w:t>
             </w:r>
           </w:p>
         </w:tc>
@@ -7585,6 +7597,10 @@
 </file>
 
 <file path=customXml/item1.xml><?xml version="1.0" encoding="utf-8"?>
+<b:Sources xmlns:b="http://schemas.openxmlformats.org/officeDocument/2006/bibliography" xmlns="http://schemas.openxmlformats.org/officeDocument/2006/bibliography" SelectedStyle="\APASixthEditionOfficeOnline.xsl" StyleName="APA" Version="6"/>
+</file>
+
+<file path=customXml/item2.xml><?xml version="1.0" encoding="utf-8"?>
 <p:properties xmlns:p="http://schemas.microsoft.com/office/2006/metadata/properties" xmlns:xsi="http://www.w3.org/2001/XMLSchema-instance" xmlns:pc="http://schemas.microsoft.com/office/infopath/2007/PartnerControls">
   <documentManagement>
     <TaxCatchAll xmlns="b34e80cf-1934-4719-b55f-e2e975c926d7" xsi:nil="true"/>
@@ -7595,11 +7611,16 @@
 </p:properties>
 </file>
 
-<file path=customXml/item2.xml><?xml version="1.0" encoding="utf-8"?>
-<b:Sources xmlns:b="http://schemas.openxmlformats.org/officeDocument/2006/bibliography" xmlns="http://schemas.openxmlformats.org/officeDocument/2006/bibliography" SelectedStyle="\APASixthEditionOfficeOnline.xsl" StyleName="APA" Version="6"/>
+<file path=customXml/item3.xml><?xml version="1.0" encoding="utf-8"?>
+<?mso-contentType ?>
+<FormTemplates xmlns="http://schemas.microsoft.com/sharepoint/v3/contenttype/forms">
+  <Display>DocumentLibraryForm</Display>
+  <Edit>DocumentLibraryForm</Edit>
+  <New>DocumentLibraryForm</New>
+</FormTemplates>
 </file>
 
-<file path=customXml/item3.xml><?xml version="1.0" encoding="utf-8"?>
+<file path=customXml/item4.xml><?xml version="1.0" encoding="utf-8"?>
 <ct:contentTypeSchema xmlns:ct="http://schemas.microsoft.com/office/2006/metadata/contentType" xmlns:ma="http://schemas.microsoft.com/office/2006/metadata/properties/metaAttributes" ct:_="" ma:_="" ma:contentTypeName="Document" ma:contentTypeID="0x010100B6EB6CCE8CCD4E4DB985DB752124FB64" ma:contentTypeVersion="10" ma:contentTypeDescription="Crée un document." ma:contentTypeScope="" ma:versionID="b659a35cc065ce33eb26c369abf814fa">
   <xsd:schema xmlns:xsd="http://www.w3.org/2001/XMLSchema" xmlns:xs="http://www.w3.org/2001/XMLSchema" xmlns:p="http://schemas.microsoft.com/office/2006/metadata/properties" xmlns:ns2="3c67b34e-3a70-4c82-a88a-c9ff4020302e" xmlns:ns3="b34e80cf-1934-4719-b55f-e2e975c926d7" targetNamespace="http://schemas.microsoft.com/office/2006/metadata/properties" ma:root="true" ma:fieldsID="c93dd5925414f1ca5912f8992d0a2fab" ns2:_="" ns3:_="">
     <xsd:import namespace="3c67b34e-3a70-4c82-a88a-c9ff4020302e"/>
@@ -7788,25 +7809,7 @@
 </ct:contentTypeSchema>
 </file>
 
-<file path=customXml/item4.xml><?xml version="1.0" encoding="utf-8"?>
-<?mso-contentType ?>
-<FormTemplates xmlns="http://schemas.microsoft.com/sharepoint/v3/contenttype/forms">
-  <Display>DocumentLibraryForm</Display>
-  <Edit>DocumentLibraryForm</Edit>
-  <New>DocumentLibraryForm</New>
-</FormTemplates>
-</file>
-
 <file path=customXml/itemProps1.xml><?xml version="1.0" encoding="utf-8"?>
-<ds:datastoreItem xmlns:ds="http://schemas.openxmlformats.org/officeDocument/2006/customXml" ds:itemID="{B1A0529D-107D-48F2-9C7A-C9B0532E61D6}">
-  <ds:schemaRefs>
-    <ds:schemaRef ds:uri="http://schemas.microsoft.com/office/2006/metadata/properties"/>
-    <ds:schemaRef ds:uri="http://schemas.microsoft.com/office/infopath/2007/PartnerControls"/>
-  </ds:schemaRefs>
-</ds:datastoreItem>
-</file>
-
-<file path=customXml/itemProps2.xml><?xml version="1.0" encoding="utf-8"?>
 <ds:datastoreItem xmlns:ds="http://schemas.openxmlformats.org/officeDocument/2006/customXml" ds:itemID="{20730C14-5559-4816-8D2F-267CB32F4239}">
   <ds:schemaRefs>
     <ds:schemaRef ds:uri="http://schemas.openxmlformats.org/officeDocument/2006/bibliography"/>
@@ -7814,14 +7817,40 @@
 </ds:datastoreItem>
 </file>
 
-<file path=customXml/itemProps3.xml><?xml version="1.0" encoding="utf-8"?>
-<ds:datastoreItem xmlns:ds="http://schemas.openxmlformats.org/officeDocument/2006/customXml" ds:itemID="{D17D70E0-7B6F-4A8F-8AEA-0C40AC466360}"/>
+<file path=customXml/itemProps2.xml><?xml version="1.0" encoding="utf-8"?>
+<ds:datastoreItem xmlns:ds="http://schemas.openxmlformats.org/officeDocument/2006/customXml" ds:itemID="{B1A0529D-107D-48F2-9C7A-C9B0532E61D6}">
+  <ds:schemaRefs>
+    <ds:schemaRef ds:uri="http://schemas.microsoft.com/office/2006/metadata/properties"/>
+    <ds:schemaRef ds:uri="http://schemas.microsoft.com/office/infopath/2007/PartnerControls"/>
+    <ds:schemaRef ds:uri="b34e80cf-1934-4719-b55f-e2e975c926d7"/>
+    <ds:schemaRef ds:uri="3c67b34e-3a70-4c82-a88a-c9ff4020302e"/>
+  </ds:schemaRefs>
+</ds:datastoreItem>
 </file>
 
-<file path=customXml/itemProps4.xml><?xml version="1.0" encoding="utf-8"?>
+<file path=customXml/itemProps3.xml><?xml version="1.0" encoding="utf-8"?>
 <ds:datastoreItem xmlns:ds="http://schemas.openxmlformats.org/officeDocument/2006/customXml" ds:itemID="{5991A026-0A3A-4A40-9DFB-B1FAB829B1E8}">
   <ds:schemaRefs>
     <ds:schemaRef ds:uri="http://schemas.microsoft.com/sharepoint/v3/contenttype/forms"/>
   </ds:schemaRefs>
 </ds:datastoreItem>
+</file>
+
+<file path=customXml/itemProps4.xml><?xml version="1.0" encoding="utf-8"?>
+<ds:datastoreItem xmlns:ds="http://schemas.openxmlformats.org/officeDocument/2006/customXml" ds:itemID="{D17D70E0-7B6F-4A8F-8AEA-0C40AC466360}">
+  <ds:schemaRefs>
+    <ds:schemaRef ds:uri="http://schemas.microsoft.com/office/2006/metadata/contentType"/>
+    <ds:schemaRef ds:uri="http://schemas.microsoft.com/office/2006/metadata/properties/metaAttributes"/>
+    <ds:schemaRef ds:uri="http://www.w3.org/2001/XMLSchema"/>
+    <ds:schemaRef ds:uri="http://schemas.microsoft.com/office/2006/metadata/properties"/>
+    <ds:schemaRef ds:uri="3c67b34e-3a70-4c82-a88a-c9ff4020302e"/>
+    <ds:schemaRef ds:uri="b34e80cf-1934-4719-b55f-e2e975c926d7"/>
+    <ds:schemaRef ds:uri="http://schemas.microsoft.com/office/2006/documentManagement/types"/>
+    <ds:schemaRef ds:uri="http://schemas.microsoft.com/office/infopath/2007/PartnerControls"/>
+    <ds:schemaRef ds:uri="http://schemas.openxmlformats.org/package/2006/metadata/core-properties"/>
+    <ds:schemaRef ds:uri="http://purl.org/dc/elements/1.1/"/>
+    <ds:schemaRef ds:uri="http://purl.org/dc/terms/"/>
+    <ds:schemaRef ds:uri="http://schemas.microsoft.com/internal/obd"/>
+  </ds:schemaRefs>
+</ds:datastoreItem>
 </file>
</xml_diff>